<commit_message>
Add illustrated Lab 1 setup and Data Logger guide
</commit_message>
<xml_diff>
--- a/site/docs/LAB1_MIE402.docx
+++ b/site/docs/LAB1_MIE402.docx
@@ -125,6 +125,123 @@
       </w:pPr>
       <w:r>
         <w:t>MIE402_Lab1_Analyze_and_PlaySound.m for checking exported MAT files</w:t>
+      </w:r>
+    </w:p>
+    <w:p>
+      <w:pPr>
+        <w:pStyle w:val="Heading1"/>
+      </w:pPr>
+      <w:r>
+        <w:t>Measurement setup and signal path</w:t>
+      </w:r>
+    </w:p>
+    <w:p>
+      <w:pPr>
+        <w:jc w:val="center"/>
+      </w:pPr>
+      <w:r>
+        <w:drawing>
+          <wp:inline xmlns:a="http://schemas.openxmlformats.org/drawingml/2006/main" xmlns:pic="http://schemas.openxmlformats.org/drawingml/2006/picture">
+            <wp:extent cx="6629400" cy="1767840"/>
+            <wp:docPr id="1" name="Picture 1"/>
+            <wp:cNvGraphicFramePr>
+              <a:graphicFrameLocks noChangeAspect="1"/>
+            </wp:cNvGraphicFramePr>
+            <a:graphic>
+              <a:graphicData uri="http://schemas.openxmlformats.org/drawingml/2006/picture">
+                <pic:pic>
+                  <pic:nvPicPr>
+                    <pic:cNvPr id="0" name="lab1-setup-schematic.png"/>
+                    <pic:cNvPicPr/>
+                  </pic:nvPicPr>
+                  <pic:blipFill>
+                    <a:blip r:embed="rId9"/>
+                    <a:stretch>
+                      <a:fillRect/>
+                    </a:stretch>
+                  </pic:blipFill>
+                  <pic:spPr>
+                    <a:xfrm>
+                      <a:off x="0" y="0"/>
+                      <a:ext cx="6629400" cy="1767840"/>
+                    </a:xfrm>
+                    <a:prstGeom prst="rect"/>
+                  </pic:spPr>
+                </pic:pic>
+              </a:graphicData>
+            </a:graphic>
+          </wp:inline>
+        </w:drawing>
+      </w:r>
+    </w:p>
+    <w:p>
+      <w:pPr>
+        <w:spacing w:after="160"/>
+        <w:jc w:val="center"/>
+      </w:pPr>
+      <w:r>
+        <w:rPr>
+          <w:i/>
+          <w:sz w:val="18"/>
+        </w:rPr>
+        <w:t>Figure 1. The complete measurement path. A sound-pressure change becomes microphone voltage, the Moku:Go stores discrete samples, and MATLAB analyzes the exported MAT file.</w:t>
+      </w:r>
+    </w:p>
+    <w:p>
+      <w:pPr>
+        <w:jc w:val="center"/>
+      </w:pPr>
+      <w:r>
+        <w:drawing>
+          <wp:inline xmlns:a="http://schemas.openxmlformats.org/drawingml/2006/main" xmlns:pic="http://schemas.openxmlformats.org/drawingml/2006/picture">
+            <wp:extent cx="5120640" cy="3842296"/>
+            <wp:docPr id="2" name="Picture 2"/>
+            <wp:cNvGraphicFramePr>
+              <a:graphicFrameLocks noChangeAspect="1"/>
+            </wp:cNvGraphicFramePr>
+            <a:graphic>
+              <a:graphicData uri="http://schemas.openxmlformats.org/drawingml/2006/picture">
+                <pic:pic>
+                  <pic:nvPicPr>
+                    <pic:cNvPr id="0" name="lab1-microphone-moku.jpg"/>
+                    <pic:cNvPicPr/>
+                  </pic:nvPicPr>
+                  <pic:blipFill>
+                    <a:blip r:embed="rId10"/>
+                    <a:stretch>
+                      <a:fillRect/>
+                    </a:stretch>
+                  </pic:blipFill>
+                  <pic:spPr>
+                    <a:xfrm>
+                      <a:off x="0" y="0"/>
+                      <a:ext cx="5120640" cy="3842296"/>
+                    </a:xfrm>
+                    <a:prstGeom prst="rect"/>
+                  </pic:spPr>
+                </pic:pic>
+              </a:graphicData>
+            </a:graphic>
+          </wp:inline>
+        </w:drawing>
+      </w:r>
+    </w:p>
+    <w:p>
+      <w:pPr>
+        <w:spacing w:after="160"/>
+        <w:jc w:val="center"/>
+      </w:pPr>
+      <w:r>
+        <w:rPr>
+          <w:i/>
+          <w:sz w:val="18"/>
+        </w:rPr>
+        <w:t>Figure 2. Connect the microphone cable to the assigned Moku:Go input. Confirm the exact channel with the GTA before recording.</w:t>
+      </w:r>
+    </w:p>
+    <w:p>
+      <w:r>
+        <w:t>The microphone output is an electrical voltage related to sound pressure. Without a microphone sensitivity calibration, report the measured amplitude in volts rather than pascals or sound-pressure level. The Moku:Go does not store a continuous curve; it stores voltage values at discrete times determined by the selected sample rate.</w:t>
       </w:r>
     </w:p>
     <w:p>
@@ -406,6 +523,90 @@
         <w:pStyle w:val="Heading1"/>
       </w:pPr>
       <w:r>
+        <w:t>Open Data Logger on the computer</w:t>
+      </w:r>
+    </w:p>
+    <w:p>
+      <w:pPr>
+        <w:jc w:val="center"/>
+      </w:pPr>
+      <w:r>
+        <w:drawing>
+          <wp:inline xmlns:a="http://schemas.openxmlformats.org/drawingml/2006/main" xmlns:pic="http://schemas.openxmlformats.org/drawingml/2006/picture">
+            <wp:extent cx="5943600" cy="3846602"/>
+            <wp:docPr id="3" name="Picture 3"/>
+            <wp:cNvGraphicFramePr>
+              <a:graphicFrameLocks noChangeAspect="1"/>
+            </wp:cNvGraphicFramePr>
+            <a:graphic>
+              <a:graphicData uri="http://schemas.openxmlformats.org/drawingml/2006/picture">
+                <pic:pic>
+                  <pic:nvPicPr>
+                    <pic:cNvPr id="0" name="lab1-select-data-logger.jpg"/>
+                    <pic:cNvPicPr/>
+                  </pic:nvPicPr>
+                  <pic:blipFill>
+                    <a:blip r:embed="rId11"/>
+                    <a:stretch>
+                      <a:fillRect/>
+                    </a:stretch>
+                  </pic:blipFill>
+                  <pic:spPr>
+                    <a:xfrm>
+                      <a:off x="0" y="0"/>
+                      <a:ext cx="5943600" cy="3846602"/>
+                    </a:xfrm>
+                    <a:prstGeom prst="rect"/>
+                  </pic:spPr>
+                </pic:pic>
+              </a:graphicData>
+            </a:graphic>
+          </wp:inline>
+        </w:drawing>
+      </w:r>
+    </w:p>
+    <w:p>
+      <w:pPr>
+        <w:spacing w:after="160"/>
+        <w:jc w:val="center"/>
+      </w:pPr>
+      <w:r>
+        <w:rPr>
+          <w:i/>
+          <w:sz w:val="18"/>
+        </w:rPr>
+        <w:t>Figure 3. In the Moku application, select Data Logger after connecting to the Moku:Go with the serial number assigned to your station.</w:t>
+      </w:r>
+    </w:p>
+    <w:p>
+      <w:pPr>
+        <w:pStyle w:val="ListBullet"/>
+      </w:pPr>
+      <w:r>
+        <w:t>Do not choose Oscilloscope or Spectrum Analyzer for the required logged records. Data Logger creates a saved time history that can be exported.</w:t>
+      </w:r>
+    </w:p>
+    <w:p>
+      <w:pPr>
+        <w:pStyle w:val="ListBullet"/>
+      </w:pPr>
+      <w:r>
+        <w:t>If another instrument is already running, use Switch instruments and select Data Logger.</w:t>
+      </w:r>
+    </w:p>
+    <w:p>
+      <w:pPr>
+        <w:pStyle w:val="ListBullet"/>
+      </w:pPr>
+      <w:r>
+        <w:t>Confirm the device serial number before changing settings so that you do not control another group’s station.</w:t>
+      </w:r>
+    </w:p>
+    <w:p>
+      <w:pPr>
+        <w:pStyle w:val="Heading1"/>
+      </w:pPr>
+      <w:r>
         <w:t>Data Logger procedure</w:t>
       </w:r>
     </w:p>
@@ -447,6 +648,218 @@
       </w:pPr>
       <w:r>
         <w:t>Repeat until the full three-source by five-rate matrix is complete. Do not overwrite earlier trials.</w:t>
+      </w:r>
+    </w:p>
+    <w:p>
+      <w:pPr>
+        <w:pStyle w:val="Heading1"/>
+      </w:pPr>
+      <w:r>
+        <w:t>Understand the Data Logger screen</w:t>
+      </w:r>
+    </w:p>
+    <w:p>
+      <w:pPr>
+        <w:jc w:val="center"/>
+      </w:pPr>
+      <w:r>
+        <w:drawing>
+          <wp:inline xmlns:a="http://schemas.openxmlformats.org/drawingml/2006/main" xmlns:pic="http://schemas.openxmlformats.org/drawingml/2006/picture">
+            <wp:extent cx="6629400" cy="4552483"/>
+            <wp:docPr id="4" name="Picture 4"/>
+            <wp:cNvGraphicFramePr>
+              <a:graphicFrameLocks noChangeAspect="1"/>
+            </wp:cNvGraphicFramePr>
+            <a:graphic>
+              <a:graphicData uri="http://schemas.openxmlformats.org/drawingml/2006/picture">
+                <pic:pic>
+                  <pic:nvPicPr>
+                    <pic:cNvPr id="0" name="lab1-data-logger-annotated.png"/>
+                    <pic:cNvPicPr/>
+                  </pic:nvPicPr>
+                  <pic:blipFill>
+                    <a:blip r:embed="rId12"/>
+                    <a:stretch>
+                      <a:fillRect/>
+                    </a:stretch>
+                  </pic:blipFill>
+                  <pic:spPr>
+                    <a:xfrm>
+                      <a:off x="0" y="0"/>
+                      <a:ext cx="6629400" cy="4552483"/>
+                    </a:xfrm>
+                    <a:prstGeom prst="rect"/>
+                  </pic:spPr>
+                </pic:pic>
+              </a:graphicData>
+            </a:graphic>
+          </wp:inline>
+        </w:drawing>
+      </w:r>
+    </w:p>
+    <w:p>
+      <w:pPr>
+        <w:spacing w:after="160"/>
+        <w:jc w:val="center"/>
+      </w:pPr>
+      <w:r>
+        <w:rPr>
+          <w:i/>
+          <w:sz w:val="18"/>
+        </w:rPr>
+        <w:t>Figure 4. Data Logger workspace. The numbered locations correspond to the checklist below. The exact layout may differ slightly with software updates.</w:t>
+      </w:r>
+    </w:p>
+    <w:p>
+      <w:pPr>
+        <w:spacing w:after="60"/>
+      </w:pPr>
+      <w:r>
+        <w:rPr>
+          <w:b/>
+        </w:rPr>
+        <w:t xml:space="preserve">1  Rate: </w:t>
+      </w:r>
+      <w:r>
+        <w:t>Enter the required sample rate fs. Check the displayed unit: Sa/s, kSa/s, or MSa/s.</w:t>
+      </w:r>
+    </w:p>
+    <w:p>
+      <w:pPr>
+        <w:spacing w:after="60"/>
+      </w:pPr>
+      <w:r>
+        <w:rPr>
+          <w:b/>
+        </w:rPr>
+        <w:t xml:space="preserve">2  Mode: </w:t>
+      </w:r>
+      <w:r>
+        <w:t>Use the GTA-specified acquisition mode, such as Precision, and record it in your notes.</w:t>
+      </w:r>
+    </w:p>
+    <w:p>
+      <w:pPr>
+        <w:spacing w:after="60"/>
+      </w:pPr>
+      <w:r>
+        <w:rPr>
+          <w:b/>
+        </w:rPr>
+        <w:t xml:space="preserve">3  Input channel: </w:t>
+      </w:r>
+      <w:r>
+        <w:t>Turn on the channel connected to the microphone and turn off unused channels. Confirm that the plotted color matches the active input.</w:t>
+      </w:r>
+    </w:p>
+    <w:p>
+      <w:pPr>
+        <w:spacing w:after="60"/>
+      </w:pPr>
+      <w:r>
+        <w:rPr>
+          <w:b/>
+        </w:rPr>
+        <w:t xml:space="preserve">4  Start: </w:t>
+      </w:r>
+      <w:r>
+        <w:t>Choose Immediate to begin when Record is pressed, or Delayed when you need time to excite the source.</w:t>
+      </w:r>
+    </w:p>
+    <w:p>
+      <w:pPr>
+        <w:spacing w:after="60"/>
+      </w:pPr>
+      <w:r>
+        <w:rPr>
+          <w:b/>
+        </w:rPr>
+        <w:t xml:space="preserve">5  Duration: </w:t>
+      </w:r>
+      <w:r>
+        <w:t>Set at least 1.0 s for every required recording. Longer records contain more samples and can provide finer FFT-bin spacing.</w:t>
+      </w:r>
+    </w:p>
+    <w:p>
+      <w:pPr>
+        <w:spacing w:after="60"/>
+      </w:pPr>
+      <w:r>
+        <w:rPr>
+          <w:b/>
+        </w:rPr>
+        <w:t xml:space="preserve">6  Filename prefix: </w:t>
+      </w:r>
+      <w:r>
+        <w:t>Identify the source, reference frequency, sample rate, and trial. Do not depend on the automatically added timestamp alone.</w:t>
+      </w:r>
+    </w:p>
+    <w:p>
+      <w:pPr>
+        <w:spacing w:after="60"/>
+      </w:pPr>
+      <w:r>
+        <w:rPr>
+          <w:b/>
+        </w:rPr>
+        <w:t xml:space="preserve">7  Record button: </w:t>
+      </w:r>
+      <w:r>
+        <w:t>Press once when the source and settings are ready. For a snap, use a delay or coordinate the event so it occurs inside the record.</w:t>
+      </w:r>
+    </w:p>
+    <w:p>
+      <w:pPr>
+        <w:spacing w:after="60"/>
+      </w:pPr>
+      <w:r>
+        <w:rPr>
+          <w:b/>
+        </w:rPr>
+        <w:t xml:space="preserve">8  Status message: </w:t>
+      </w:r>
+      <w:r>
+        <w:t>Wait for completion and confirm that a file was saved. A completed message does not by itself prove the signal is useful; inspect the waveform.</w:t>
+      </w:r>
+    </w:p>
+    <w:p>
+      <w:pPr>
+        <w:pStyle w:val="Heading1"/>
+      </w:pPr>
+      <w:r>
+        <w:t>Check the waveform before accepting a trial</w:t>
+      </w:r>
+    </w:p>
+    <w:p>
+      <w:pPr>
+        <w:pStyle w:val="ListBullet"/>
+      </w:pPr>
+      <w:r>
+        <w:t>A useful high-rate tuning-fork record should show a decaying, nearly periodic voltage signal rather than a flat line.</w:t>
+      </w:r>
+    </w:p>
+    <w:p>
+      <w:pPr>
+        <w:pStyle w:val="ListBullet"/>
+      </w:pPr>
+      <w:r>
+        <w:t>Flat-topped positive or negative peaks indicate clipping. Reduce the input gain or increase the input range, then repeat the trial.</w:t>
+      </w:r>
+    </w:p>
+    <w:p>
+      <w:pPr>
+        <w:pStyle w:val="ListBullet"/>
+      </w:pPr>
+      <w:r>
+        <w:t>A very small trace may mean the microphone is too far away, the wrong input is active, the cable is loose, or the event was missed.</w:t>
+      </w:r>
+    </w:p>
+    <w:p>
+      <w:pPr>
+        <w:pStyle w:val="ListBullet"/>
+      </w:pPr>
+      <w:r>
+        <w:t>At low sample rates, a misleading smooth or constant trace can be a sampling effect. Troubleshoot the hardware using a known high-rate setting.</w:t>
       </w:r>
     </w:p>
     <w:p>
@@ -503,6 +916,158 @@
       </w:pPr>
       <w:r>
         <w:t>Back up all raw MAT files, the analysis file, exported figures, and acquisition notes before leaving.</w:t>
+      </w:r>
+    </w:p>
+    <w:p>
+      <w:pPr>
+        <w:pStyle w:val="Heading1"/>
+      </w:pPr>
+      <w:r>
+        <w:t>Export the recording as a MATLAB file</w:t>
+      </w:r>
+    </w:p>
+    <w:p>
+      <w:pPr>
+        <w:jc w:val="center"/>
+      </w:pPr>
+      <w:r>
+        <w:drawing>
+          <wp:inline xmlns:a="http://schemas.openxmlformats.org/drawingml/2006/main" xmlns:pic="http://schemas.openxmlformats.org/drawingml/2006/picture">
+            <wp:extent cx="956696" cy="2286000"/>
+            <wp:docPr id="5" name="Picture 5"/>
+            <wp:cNvGraphicFramePr>
+              <a:graphicFrameLocks noChangeAspect="1"/>
+            </wp:cNvGraphicFramePr>
+            <a:graphic>
+              <a:graphicData uri="http://schemas.openxmlformats.org/drawingml/2006/picture">
+                <pic:pic>
+                  <pic:nvPicPr>
+                    <pic:cNvPr id="0" name="lab1-file-manager-menu.jpg"/>
+                    <pic:cNvPicPr/>
+                  </pic:nvPicPr>
+                  <pic:blipFill>
+                    <a:blip r:embed="rId13"/>
+                    <a:stretch>
+                      <a:fillRect/>
+                    </a:stretch>
+                  </pic:blipFill>
+                  <pic:spPr>
+                    <a:xfrm>
+                      <a:off x="0" y="0"/>
+                      <a:ext cx="956696" cy="2286000"/>
+                    </a:xfrm>
+                    <a:prstGeom prst="rect"/>
+                  </pic:spPr>
+                </pic:pic>
+              </a:graphicData>
+            </a:graphic>
+          </wp:inline>
+        </w:drawing>
+      </w:r>
+    </w:p>
+    <w:p>
+      <w:pPr>
+        <w:spacing w:after="160"/>
+        <w:jc w:val="center"/>
+      </w:pPr>
+      <w:r>
+        <w:rPr>
+          <w:i/>
+          <w:sz w:val="18"/>
+        </w:rPr>
+        <w:t>Figure 5. Open the main menu and choose File manager after recording is complete.</w:t>
+      </w:r>
+    </w:p>
+    <w:p>
+      <w:pPr>
+        <w:pStyle w:val="ListBullet"/>
+      </w:pPr>
+      <w:r>
+        <w:t>Open File manager only after the status area confirms that logging has completed.</w:t>
+      </w:r>
+    </w:p>
+    <w:p>
+      <w:pPr>
+        <w:pStyle w:val="ListBullet"/>
+      </w:pPr>
+      <w:r>
+        <w:t>Select the recording by its source, rate, and trial name. Do not rely on the timestamp to distinguish files.</w:t>
+      </w:r>
+    </w:p>
+    <w:p>
+      <w:pPr>
+        <w:pStyle w:val="ListBullet"/>
+      </w:pPr>
+      <w:r>
+        <w:t>Keep the native recording until the converted MAT file has been opened and verified.</w:t>
+      </w:r>
+    </w:p>
+    <w:p>
+      <w:pPr>
+        <w:jc w:val="center"/>
+      </w:pPr>
+      <w:r>
+        <w:drawing>
+          <wp:inline xmlns:a="http://schemas.openxmlformats.org/drawingml/2006/main" xmlns:pic="http://schemas.openxmlformats.org/drawingml/2006/picture">
+            <wp:extent cx="3338843" cy="3657600"/>
+            <wp:docPr id="6" name="Picture 6"/>
+            <wp:cNvGraphicFramePr>
+              <a:graphicFrameLocks noChangeAspect="1"/>
+            </wp:cNvGraphicFramePr>
+            <a:graphic>
+              <a:graphicData uri="http://schemas.openxmlformats.org/drawingml/2006/picture">
+                <pic:pic>
+                  <pic:nvPicPr>
+                    <pic:cNvPr id="0" name="lab1-file-manager-export.jpg"/>
+                    <pic:cNvPicPr/>
+                  </pic:nvPicPr>
+                  <pic:blipFill>
+                    <a:blip r:embed="rId14"/>
+                    <a:stretch>
+                      <a:fillRect/>
+                    </a:stretch>
+                  </pic:blipFill>
+                  <pic:spPr>
+                    <a:xfrm>
+                      <a:off x="0" y="0"/>
+                      <a:ext cx="3338843" cy="3657600"/>
+                    </a:xfrm>
+                    <a:prstGeom prst="rect"/>
+                  </pic:spPr>
+                </pic:pic>
+              </a:graphicData>
+            </a:graphic>
+          </wp:inline>
+        </w:drawing>
+      </w:r>
+    </w:p>
+    <w:p>
+      <w:pPr>
+        <w:spacing w:after="160"/>
+        <w:jc w:val="center"/>
+      </w:pPr>
+      <w:r>
+        <w:rPr>
+          <w:i/>
+          <w:sz w:val="18"/>
+        </w:rPr>
+        <w:t>Figure 6. Select the required recording, choose MATLAB under Convert to, choose the destination folder, and press Download.</w:t>
+      </w:r>
+    </w:p>
+    <w:p>
+      <w:pPr>
+        <w:pStyle w:val="ListBullet"/>
+      </w:pPr>
+      <w:r>
+        <w:t>Check the filename before download. Similar names can cause analysis of the wrong rate or source.</w:t>
+      </w:r>
+    </w:p>
+    <w:p>
+      <w:pPr>
+        <w:pStyle w:val="ListBullet"/>
+      </w:pPr>
+      <w:r>
+        <w:t>The expected MATLAB data array normally uses column 1 for time and column 2 for the active-channel voltage. Ask the GTA if the exported structure differs.</w:t>
       </w:r>
     </w:p>
     <w:p>
@@ -692,7 +1257,7 @@
       </w:r>
     </w:p>
     <w:sectPr>
-      <w:footerReference w:type="default" r:id="rId9"/>
+      <w:footerReference w:type="default" r:id="rId15"/>
       <w:pgSz w:w="12240" w:h="15840"/>
       <w:pgMar w:top="936" w:right="1080" w:bottom="936" w:left="1080" w:header="720" w:footer="720" w:gutter="0"/>
       <w:cols w:space="720"/>

</xml_diff>